<commit_message>
Changing presentation and report to match new code
</commit_message>
<xml_diff>
--- a/report/OOP_Capstone_Report_Group13.docx
+++ b/report/OOP_Capstone_Report_Group13.docx
@@ -2224,10 +2224,13 @@
         <w:t>Methods:</w:t>
       </w:r>
       <w:r>
-        <w:t> onPlayerMove(),postGameVisualEffect()</w:t>
-      </w:r>
-      <w:r>
-        <w:t>,</w:t>
+        <w:t> onPlayerMove(),</w:t>
+      </w:r>
+      <w:r>
+        <w:t xml:space="preserve"> </w:t>
+      </w:r>
+      <w:r>
+        <w:t>postGameVisualEffect()</w:t>
       </w:r>
     </w:p>
     <w:p>
@@ -2367,10 +2370,22 @@
         <w:t>Methods:</w:t>
       </w:r>
       <w:r>
-        <w:t> animateMove(),updateScoreUI(),postGameVisualEffect()</w:t>
-      </w:r>
-      <w:r>
-        <w:t xml:space="preserve">, </w:t>
+        <w:t> animateMove(),</w:t>
+      </w:r>
+      <w:r>
+        <w:t xml:space="preserve"> </w:t>
+      </w:r>
+      <w:r>
+        <w:t>updateScoreUI(),</w:t>
+      </w:r>
+      <w:r>
+        <w:t xml:space="preserve"> </w:t>
+      </w:r>
+      <w:r>
+        <w:t>postGameVisualEffect()</w:t>
+      </w:r>
+      <w:r>
+        <w:t xml:space="preserve"> </w:t>
       </w:r>
       <w:r>
         <w:t>(MainGameController.java)</w:t>
@@ -2656,7 +2671,25 @@
         <w:jc w:val="both"/>
       </w:pPr>
       <w:r>
-        <w:t>Designed and implemented a BaseController architecture using inheritance to provide shared functionalities for scene navigation and common controller interactions.</w:t>
+        <w:t xml:space="preserve">Designed and implemented a </w:t>
+      </w:r>
+      <w:r>
+        <w:t>SceneNavigator</w:t>
+      </w:r>
+      <w:r>
+        <w:t xml:space="preserve"> </w:t>
+      </w:r>
+      <w:r>
+        <w:t>class</w:t>
+      </w:r>
+      <w:r>
+        <w:t xml:space="preserve"> </w:t>
+      </w:r>
+      <w:r>
+        <w:t>to provide shared scene navigation functionality across all controllers</w:t>
+      </w:r>
+      <w:r>
+        <w:t>.</w:t>
       </w:r>
     </w:p>
     <w:p>
@@ -2691,7 +2724,26 @@
         <w:t>Classes:</w:t>
       </w:r>
       <w:r>
-        <w:t>Game.java,BaseController.java,EndingController.java, InstructionController.java, MenuController.java.</w:t>
+        <w:rPr>
+          <w:b/>
+          <w:bCs/>
+        </w:rPr>
+        <w:t xml:space="preserve"> </w:t>
+      </w:r>
+      <w:r>
+        <w:t>Game.java,</w:t>
+      </w:r>
+      <w:r>
+        <w:t xml:space="preserve"> SceneNavigator</w:t>
+      </w:r>
+      <w:r>
+        <w:t>.java,</w:t>
+      </w:r>
+      <w:r>
+        <w:t xml:space="preserve"> </w:t>
+      </w:r>
+      <w:r>
+        <w:t>EndingController.java, InstructionController.java, MenuController.java.</w:t>
       </w:r>
     </w:p>
     <w:p>
@@ -2712,13 +2764,14 @@
         <w:t>Methods:</w:t>
       </w:r>
       <w:r>
-        <w:t>initializePlayerData(),loadEndingScene()</w:t>
-      </w:r>
-      <w:r>
-        <w:t>,</w:t>
-      </w:r>
-      <w:r>
-        <w:t xml:space="preserve"> (MainGameController.java).</w:t>
+        <w:rPr>
+          <w:b/>
+          <w:bCs/>
+        </w:rPr>
+        <w:t xml:space="preserve"> </w:t>
+      </w:r>
+      <w:r>
+        <w:t>initializePlayerData() (MainGameController.java).</w:t>
       </w:r>
     </w:p>
     <w:p>
@@ -2816,7 +2869,6 @@
         <w:jc w:val="both"/>
       </w:pPr>
       <w:r>
-        <w:lastRenderedPageBreak/>
         <w:t>If the last distributed gem lands before a non-empty small square (not a half-circle), the player continues the move by collecting all gems from that square and redistributing them.</w:t>
       </w:r>
     </w:p>
@@ -2831,6 +2883,7 @@
         <w:jc w:val="both"/>
       </w:pPr>
       <w:r>
+        <w:lastRenderedPageBreak/>
         <w:t>If the last distributed gem lands before an empty square and the following square contains gems, those gems are captured and added to the player's score. Capturing can happen in a streak.</w:t>
       </w:r>
     </w:p>
@@ -2900,7 +2953,6 @@
         <w:rPr>
           <w:noProof/>
         </w:rPr>
-        <w:lastRenderedPageBreak/>
         <w:drawing>
           <wp:inline distT="0" distB="0" distL="0" distR="0" wp14:anchorId="74E7A9E6" wp14:editId="079388D7">
             <wp:extent cx="4381500" cy="3438525"/>
@@ -2968,6 +3020,7 @@
         <w:rPr>
           <w:color w:val="auto"/>
         </w:rPr>
+        <w:lastRenderedPageBreak/>
         <w:t>2.4. Use Case Diagram Explanation</w:t>
       </w:r>
       <w:bookmarkEnd w:id="10"/>
@@ -3045,7 +3098,6 @@
         <w:rPr>
           <w:color w:val="auto"/>
         </w:rPr>
-        <w:lastRenderedPageBreak/>
         <w:t>3.1. General Class Diagram</w:t>
       </w:r>
       <w:bookmarkEnd w:id="12"/>
@@ -3072,11 +3124,12 @@
           <w:szCs w:val="22"/>
           <w:bdr w:val="none" w:sz="0" w:space="0" w:color="auto" w:frame="1"/>
         </w:rPr>
+        <w:lastRenderedPageBreak/>
         <w:drawing>
-          <wp:inline distT="0" distB="0" distL="0" distR="0" wp14:anchorId="5FB3C029" wp14:editId="41F5614B">
-            <wp:extent cx="5731510" cy="3931920"/>
-            <wp:effectExtent l="0" t="0" r="2540" b="0"/>
-            <wp:docPr id="376644551" name="Picture 1" descr="A diagram of a computer server&#10;&#10;Description automatically generated"/>
+          <wp:inline distT="0" distB="0" distL="0" distR="0" wp14:anchorId="5FB3C029" wp14:editId="35DB3DCE">
+            <wp:extent cx="5727982" cy="3931920"/>
+            <wp:effectExtent l="0" t="0" r="6350" b="0"/>
+            <wp:docPr id="376644551" name="Picture 1"/>
             <wp:cNvGraphicFramePr>
               <a:graphicFrameLocks xmlns:a="http://schemas.openxmlformats.org/drawingml/2006/main" noChangeAspect="1"/>
             </wp:cNvGraphicFramePr>
@@ -3084,20 +3137,19 @@
               <a:graphicData uri="http://schemas.openxmlformats.org/drawingml/2006/picture">
                 <pic:pic xmlns:pic="http://schemas.openxmlformats.org/drawingml/2006/picture">
                   <pic:nvPicPr>
-                    <pic:cNvPr id="376644551" name="Picture 1" descr="A diagram of a computer server&#10;&#10;Description automatically generated"/>
+                    <pic:cNvPr id="376644551" name="Picture 1"/>
                     <pic:cNvPicPr>
                       <a:picLocks noChangeAspect="1" noChangeArrowheads="1"/>
                     </pic:cNvPicPr>
                   </pic:nvPicPr>
                   <pic:blipFill>
-                    <a:blip r:embed="rId9">
+                    <a:blip r:embed="rId9" cstate="print">
                       <a:extLst>
                         <a:ext uri="{28A0092B-C50C-407E-A947-70E740481C1C}">
                           <a14:useLocalDpi xmlns:a14="http://schemas.microsoft.com/office/drawing/2010/main" val="0"/>
                         </a:ext>
                       </a:extLst>
                     </a:blip>
-                    <a:srcRect/>
                     <a:stretch>
                       <a:fillRect/>
                     </a:stretch>
@@ -3105,7 +3157,7 @@
                   <pic:spPr bwMode="auto">
                     <a:xfrm>
                       <a:off x="0" y="0"/>
-                      <a:ext cx="5731510" cy="3931920"/>
+                      <a:ext cx="5727982" cy="3931920"/>
                     </a:xfrm>
                     <a:prstGeom prst="rect">
                       <a:avLst/>
@@ -3143,20 +3195,23 @@
         <w:t xml:space="preserve"> and </w:t>
       </w:r>
       <w:r>
-        <w:t xml:space="preserve">visual highlighting. Inheritance is used to create BigGem and SmallGem from BaseGem. To support different rendering behaviors, CastleCellRenderer and SmallCellRenderer both implement the CellRenderer interface. This design allows different types of cells to be rendered through a common interface while providing their own implementations, illustrating polymorphism. The </w:t>
-      </w:r>
+        <w:t>visual highlighting. Inheritance is used to create BigGem and SmallGem from BaseGem. To support different rendering behaviors, CastleCellRenderer and SmallCellRenderer both implement the CellRenderer interface. This design allows different types of cells to be rendered through a common interface while providing their own implementations, illustrating polymorphism. The GemLayoutUtil class functions as a helper class responsible for calculating and assigning the position of a particular gem within a cell. GemRenderer aggregates twelve CellRenderer instances to render the board cells, while SquareHighlighter provides visual feedback by highlighting valid squares and movement directions during gameplay.</w:t>
+      </w:r>
+    </w:p>
+    <w:p>
+      <w:pPr>
+        <w:spacing w:after="120" w:line="312" w:lineRule="auto"/>
+        <w:jc w:val="both"/>
+      </w:pPr>
       <w:r>
         <w:lastRenderedPageBreak/>
-        <w:t>GemLayoutUtil class functions as a helper class responsible for calculating and assigning the position of a particular gem within a cell. GemRenderer aggregates twelve CellRenderer instances to render the board cells, while SquareHighlighter provides visual feedback by highlighting valid squares and movement directions during gameplay.</w:t>
-      </w:r>
-    </w:p>
-    <w:p>
-      <w:pPr>
-        <w:spacing w:after="120" w:line="312" w:lineRule="auto"/>
-        <w:jc w:val="both"/>
-      </w:pPr>
-      <w:r>
-        <w:t>The Controller package manages user interactions and coordinates communication between the View and Model packages. Each FXML scene is associated with a dedicated controller class. Because these controllers share common functionalities, they inherit from a BaseController. The MainGameController is the primary controller responsible for gameplay interactions. It interacts with SquareHighlighter and GemRenderer in the View package to synchronize visual highlighting and board rendering with the underlying game logic. Furthermore, MainGameController aggregates an instance of Game to interact with the game logic.</w:t>
+        <w:t xml:space="preserve">The Controller package manages user interactions and coordinates communication between the View and Model packages. Each FXML scene is associated with a dedicated controller class. </w:t>
+      </w:r>
+      <w:r>
+        <w:t>These controllers share common scene navigation functionality through an association with the SceneNavigator class</w:t>
+      </w:r>
+      <w:r>
+        <w:t>. The MainGameController is the primary controller responsible for gameplay interactions. It interacts with SquareHighlighter and GemRenderer in the View package to synchronize visual highlighting and board rendering with the underlying game logic. Furthermore, MainGameController aggregates an instance of Game to interact with the game logic.</w:t>
       </w:r>
     </w:p>
     <w:p>
@@ -3219,7 +3274,6 @@
           <w:szCs w:val="22"/>
           <w:bdr w:val="none" w:sz="0" w:space="0" w:color="auto" w:frame="1"/>
         </w:rPr>
-        <w:lastRenderedPageBreak/>
         <w:drawing>
           <wp:inline distT="0" distB="0" distL="0" distR="0" wp14:anchorId="0570409C" wp14:editId="336888CB">
             <wp:extent cx="5731510" cy="5382260"/>
@@ -3263,7 +3317,11 @@
         <w:jc w:val="both"/>
       </w:pPr>
       <w:r>
-        <w:t>The Board class manages the value of each cell by an array table[], indexed from the left Mandarin square and continuing in the clockwise direction around the board. One of the most important methods in the Board class is moveGem(), which implements the gem distribution mechanics based on the input. It returns a list of pairs &lt;cell, value&gt;, where cell is the index of the modified cell and value is its new value after the change. For example, from the initial state, if the user chooses the 3rd cell and the clockwise direction, the sequence will be &lt;3,0&gt;, &lt;4,6&gt;, &lt;5,6&gt;, &lt;6,6&gt;, &lt;7,6&gt;, &lt;8,6&gt;, &lt;9,0&gt;, &lt;10,6&gt;, &lt;11,6&gt;, &lt;0,6&gt;, &lt;1,6&gt;, &lt;2,6&gt;. The method terminates when the distribution phase reaches a stopping condition defined by the game rules.</w:t>
+        <w:t xml:space="preserve">The Board class manages the value of each cell by an array table[], indexed from the left Mandarin square and continuing in the clockwise direction around the board. One of the most important methods in the Board class is moveGem(), which implements the </w:t>
+      </w:r>
+      <w:r>
+        <w:lastRenderedPageBreak/>
+        <w:t>gem distribution mechanics based on the input. It returns a list of pairs &lt;cell, value&gt;, where cell is the index of the modified cell and value is its new value after the change. For example, from the initial state, if the user chooses the 3rd cell and the clockwise direction, the sequence will be &lt;3,0&gt;, &lt;4,6&gt;, &lt;5,6&gt;, &lt;6,6&gt;, &lt;7,6&gt;, &lt;8,6&gt;, &lt;9,0&gt;, &lt;10,6&gt;, &lt;11,6&gt;, &lt;0,6&gt;, &lt;1,6&gt;, &lt;2,6&gt;. The method terminates when the distribution phase reaches a stopping condition defined by the game rules.</w:t>
       </w:r>
     </w:p>
     <w:p>
@@ -3272,11 +3330,7 @@
         <w:jc w:val="both"/>
       </w:pPr>
       <w:r>
-        <w:t xml:space="preserve">The most important methods are processingTurn() and postTurnProcessing() in the Game class, which together manage the majority of the game logic. processingTurn() handles the turn after receiving the input. It first calls the moveGem() method from the Board class to receive a move sequence. It then performs the capturing logic based on </w:t>
-      </w:r>
-      <w:r>
-        <w:lastRenderedPageBreak/>
-        <w:t>the final position of the move, before returning a full move sequence from the start until the end of a turn. This move sequence is later used by the Controller to update the GUI and animate the gameplay.</w:t>
+        <w:t>The most important methods are processingTurn() and postTurnProcessing() in the Game class, which together manage the majority of the game logic. processingTurn() handles the turn after receiving the input. It first calls the moveGem() method from the Board class to receive a move sequence. It then performs the capturing logic based on the final position of the move, before returning a full move sequence from the start until the end of a turn. This move sequence is later used by the Controller to update the GUI and animate the gameplay.</w:t>
       </w:r>
     </w:p>
     <w:p>
@@ -3332,6 +3386,7 @@
           <w:szCs w:val="22"/>
           <w:bdr w:val="none" w:sz="0" w:space="0" w:color="auto" w:frame="1"/>
         </w:rPr>
+        <w:lastRenderedPageBreak/>
         <w:drawing>
           <wp:inline distT="0" distB="0" distL="0" distR="0" wp14:anchorId="7CE66F46" wp14:editId="57A8DFDA">
             <wp:extent cx="5731510" cy="4351020"/>
@@ -3397,11 +3452,7 @@
         <w:jc w:val="both"/>
       </w:pPr>
       <w:r>
-        <w:t xml:space="preserve">When the renderGemsInCell() method is invoked, GemRenderer selects the appropriate CellRenderer corresponding to the target cell and calls its render() method. Due to dynamic binding, the actual method executed depends on the runtime type of the object. For the two Mandarin cells (indices 0 and 6), the render() method of CastleCellRenderer </w:t>
-      </w:r>
-      <w:r>
-        <w:lastRenderedPageBreak/>
-        <w:t>is executed, which renders a BigGem and arranges any remaining SmallGem objects beneath it. For all other cells, the render() method of SmallCellRenderer is executed, which renders the SmallGem objects in a grid layout. This approach eliminates the need for conditional rendering logic inside GemRenderer and makes the rendering system easily extensible.</w:t>
+        <w:t>When the renderGemsInCell() method is invoked, GemRenderer selects the appropriate CellRenderer corresponding to the target cell and calls its render() method. Due to dynamic binding, the actual method executed depends on the runtime type of the object. For the two Mandarin cells (indices 0 and 6), the render() method of CastleCellRenderer is executed, which renders a BigGem and arranges any remaining SmallGem objects beneath it. For all other cells, the render() method of SmallCellRenderer is executed, which renders the SmallGem objects in a grid layout. This approach eliminates the need for conditional rendering logic inside GemRenderer and makes the rendering system easily extensible.</w:t>
       </w:r>
     </w:p>
     <w:p>
@@ -3448,11 +3499,12 @@
           <w:szCs w:val="22"/>
           <w:bdr w:val="none" w:sz="0" w:space="0" w:color="auto" w:frame="1"/>
         </w:rPr>
+        <w:lastRenderedPageBreak/>
         <w:drawing>
-          <wp:inline distT="0" distB="0" distL="0" distR="0" wp14:anchorId="2BDE9E26" wp14:editId="04A09A9F">
-            <wp:extent cx="5731510" cy="2237105"/>
-            <wp:effectExtent l="0" t="0" r="2540" b="0"/>
-            <wp:docPr id="1614133621" name="Picture 5" descr="A screenshot of a computer&#10;&#10;Description automatically generated"/>
+          <wp:inline distT="0" distB="0" distL="0" distR="0" wp14:anchorId="2BDE9E26" wp14:editId="6B8F7CEF">
+            <wp:extent cx="5731510" cy="2200386"/>
+            <wp:effectExtent l="0" t="0" r="2540" b="9525"/>
+            <wp:docPr id="1614133621" name="Picture 5"/>
             <wp:cNvGraphicFramePr>
               <a:graphicFrameLocks xmlns:a="http://schemas.openxmlformats.org/drawingml/2006/main" noChangeAspect="1"/>
             </wp:cNvGraphicFramePr>
@@ -3460,20 +3512,19 @@
               <a:graphicData uri="http://schemas.openxmlformats.org/drawingml/2006/picture">
                 <pic:pic xmlns:pic="http://schemas.openxmlformats.org/drawingml/2006/picture">
                   <pic:nvPicPr>
-                    <pic:cNvPr id="1614133621" name="Picture 5" descr="A screenshot of a computer&#10;&#10;Description automatically generated"/>
+                    <pic:cNvPr id="1614133621" name="Picture 5"/>
                     <pic:cNvPicPr>
                       <a:picLocks noChangeAspect="1" noChangeArrowheads="1"/>
                     </pic:cNvPicPr>
                   </pic:nvPicPr>
                   <pic:blipFill>
-                    <a:blip r:embed="rId12">
+                    <a:blip r:embed="rId12" cstate="print">
                       <a:extLst>
                         <a:ext uri="{28A0092B-C50C-407E-A947-70E740481C1C}">
                           <a14:useLocalDpi xmlns:a14="http://schemas.microsoft.com/office/drawing/2010/main" val="0"/>
                         </a:ext>
                       </a:extLst>
                     </a:blip>
-                    <a:srcRect/>
                     <a:stretch>
                       <a:fillRect/>
                     </a:stretch>
@@ -3481,7 +3532,7 @@
                   <pic:spPr bwMode="auto">
                     <a:xfrm>
                       <a:off x="0" y="0"/>
-                      <a:ext cx="5731510" cy="2237105"/>
+                      <a:ext cx="5731510" cy="2200386"/>
                     </a:xfrm>
                     <a:prstGeom prst="rect">
                       <a:avLst/>
@@ -3522,26 +3573,26 @@
         <w:jc w:val="both"/>
       </w:pPr>
       <w:r>
-        <w:t xml:space="preserve">At the beginning of onPlayerMove(), state is set to -1 to temporarily disable further user interaction while the move is being processed and animated. The method first calls processingTurn() in the Game class to obtain the complete sequence of board changes resulting from the player's move, including any captures. This sequence is then passed </w:t>
+        <w:t>At the beginning of onPlayerMove(), state is set to -1 to temporarily disable further user interaction while the move is being processed and animated. The method first calls processingTurn() in the Game class to obtain the complete sequence of board changes resulting from the player's move, including any captures. This sequence is then passed to animateMoves(), which uses a JavaFX Timeline to display the movement step by step. This approach prevents the board from immediately updating to its final state and allows players to observe the progression of the move.</w:t>
+      </w:r>
+    </w:p>
+    <w:p>
+      <w:pPr>
+        <w:spacing w:after="120" w:line="312" w:lineRule="auto"/>
+        <w:jc w:val="both"/>
+      </w:pPr>
+      <w:r>
+        <w:t>After the animation finishes, the controller updates the score display and calls postTurnProcessing() in the Game class.</w:t>
+      </w:r>
+      <w:r>
+        <w:t xml:space="preserve"> </w:t>
+      </w:r>
+      <w:r>
+        <w:t xml:space="preserve">If the game has ended, postGameVisualEffect() is executed to clear the board visually and highlight the winner by making the winning score flicker. Finally, the ending scene is loaded to display the </w:t>
       </w:r>
       <w:r>
         <w:lastRenderedPageBreak/>
-        <w:t>to animateMoves(), which uses a JavaFX Timeline to display the movement step by step. This approach prevents the board from immediately updating to its final state and allows players to observe the progression of the move.</w:t>
-      </w:r>
-    </w:p>
-    <w:p>
-      <w:pPr>
-        <w:spacing w:after="120" w:line="312" w:lineRule="auto"/>
-        <w:jc w:val="both"/>
-      </w:pPr>
-      <w:r>
-        <w:t>After the animation finishes, the controller updates the score display and calls postTurnProcessing() in the Game class.</w:t>
-      </w:r>
-      <w:r>
-        <w:t xml:space="preserve"> </w:t>
-      </w:r>
-      <w:r>
-        <w:t>If the game has ended, postGameVisualEffect() is executed to clear the board visually and highlight the winner by making the winning score flicker. Finally, the ending scene is loaded to display the game result.</w:t>
+        <w:t>game result.</w:t>
       </w:r>
       <w:r>
         <w:t xml:space="preserve"> p</w:t>

</xml_diff>

<commit_message>
Modifying presentation and report again
</commit_message>
<xml_diff>
--- a/report/OOP_Capstone_Report_Group13.docx
+++ b/report/OOP_Capstone_Report_Group13.docx
@@ -2154,7 +2154,15 @@
         <w:jc w:val="both"/>
       </w:pPr>
       <w:r>
-        <w:t>Developed the static GUI layout and styling (.fxml and .css files).</w:t>
+        <w:t xml:space="preserve">Developed the static GUI layout and styling </w:t>
+      </w:r>
+      <w:proofErr w:type="gramStart"/>
+      <w:r>
+        <w:t>(.fxml</w:t>
+      </w:r>
+      <w:proofErr w:type="gramEnd"/>
+      <w:r>
+        <w:t xml:space="preserve"> and .css files).</w:t>
       </w:r>
     </w:p>
     <w:p>
@@ -2224,13 +2232,26 @@
         <w:t>Methods:</w:t>
       </w:r>
       <w:r>
-        <w:t> onPlayerMove(),</w:t>
+        <w:t> </w:t>
+      </w:r>
+      <w:proofErr w:type="gramStart"/>
+      <w:r>
+        <w:t>onPlayerMove(</w:t>
+      </w:r>
+      <w:proofErr w:type="gramEnd"/>
+      <w:r>
+        <w:t>),</w:t>
       </w:r>
       <w:r>
         <w:t xml:space="preserve"> </w:t>
       </w:r>
-      <w:r>
-        <w:t>postGameVisualEffect()</w:t>
+      <w:proofErr w:type="gramStart"/>
+      <w:r>
+        <w:t>postGameVisualEffect(</w:t>
+      </w:r>
+      <w:proofErr w:type="gramEnd"/>
+      <w:r>
+        <w:t>)</w:t>
       </w:r>
     </w:p>
     <w:p>
@@ -2370,19 +2391,37 @@
         <w:t>Methods:</w:t>
       </w:r>
       <w:r>
-        <w:t> animateMove(),</w:t>
+        <w:t> </w:t>
+      </w:r>
+      <w:proofErr w:type="gramStart"/>
+      <w:r>
+        <w:t>animateMove(</w:t>
+      </w:r>
+      <w:proofErr w:type="gramEnd"/>
+      <w:r>
+        <w:t>),</w:t>
       </w:r>
       <w:r>
         <w:t xml:space="preserve"> </w:t>
       </w:r>
-      <w:r>
-        <w:t>updateScoreUI(),</w:t>
+      <w:proofErr w:type="gramStart"/>
+      <w:r>
+        <w:t>updateScoreUI(</w:t>
+      </w:r>
+      <w:proofErr w:type="gramEnd"/>
+      <w:r>
+        <w:t>),</w:t>
       </w:r>
       <w:r>
         <w:t xml:space="preserve"> </w:t>
       </w:r>
-      <w:r>
-        <w:t>postGameVisualEffect()</w:t>
+      <w:proofErr w:type="gramStart"/>
+      <w:r>
+        <w:t>postGameVisualEffect(</w:t>
+      </w:r>
+      <w:proofErr w:type="gramEnd"/>
+      <w:r>
+        <w:t>)</w:t>
       </w:r>
       <w:r>
         <w:t xml:space="preserve"> </w:t>
@@ -2499,8 +2538,13 @@
         </w:rPr>
         <w:t xml:space="preserve">Methods: </w:t>
       </w:r>
-      <w:r>
-        <w:t>getInput() (MainGameController.java).</w:t>
+      <w:proofErr w:type="gramStart"/>
+      <w:r>
+        <w:t>getInput(</w:t>
+      </w:r>
+      <w:proofErr w:type="gramEnd"/>
+      <w:r>
+        <w:t>) (MainGameController.java).</w:t>
       </w:r>
     </w:p>
     <w:p>
@@ -2770,8 +2814,13 @@
         </w:rPr>
         <w:t xml:space="preserve"> </w:t>
       </w:r>
-      <w:r>
-        <w:t>initializePlayerData() (MainGameController.java).</w:t>
+      <w:proofErr w:type="gramStart"/>
+      <w:r>
+        <w:t>initializePlayerData(</w:t>
+      </w:r>
+      <w:proofErr w:type="gramEnd"/>
+      <w:r>
+        <w:t>) (MainGameController.java).</w:t>
       </w:r>
     </w:p>
     <w:p>
@@ -3031,7 +3080,15 @@
         <w:jc w:val="both"/>
       </w:pPr>
       <w:r>
-        <w:t>Upon opening the application, the user is met with a menu interface. The user can click the Exit button, which prompts an exit confirmation. The user can click on the Instruction button to view the instructions. Most importantly, the user can click on the Play button to create a new game.</w:t>
+        <w:t xml:space="preserve">Upon opening the application, the user is met with a menu interface. The user can click the Exit button, which prompts </w:t>
+      </w:r>
+      <w:proofErr w:type="gramStart"/>
+      <w:r>
+        <w:t>an exit</w:t>
+      </w:r>
+      <w:proofErr w:type="gramEnd"/>
+      <w:r>
+        <w:t xml:space="preserve"> confirmation. The user can click on the Instruction button to view the instructions. Most importantly, the user can click on the Play button to create a new game.</w:t>
       </w:r>
     </w:p>
     <w:p>
@@ -3058,7 +3115,15 @@
         <w:jc w:val="both"/>
       </w:pPr>
       <w:r>
-        <w:t>When the game ends, the player can view the result screen, which displays the final outcome of the match and the winner.</w:t>
+        <w:t xml:space="preserve">When the game ends, the player can view the result screen, which displays the </w:t>
+      </w:r>
+      <w:proofErr w:type="gramStart"/>
+      <w:r>
+        <w:t>final outcome</w:t>
+      </w:r>
+      <w:proofErr w:type="gramEnd"/>
+      <w:r>
+        <w:t xml:space="preserve"> of the match and the winner.</w:t>
       </w:r>
     </w:p>
     <w:p>
@@ -3126,7 +3191,7 @@
         </w:rPr>
         <w:lastRenderedPageBreak/>
         <w:drawing>
-          <wp:inline distT="0" distB="0" distL="0" distR="0" wp14:anchorId="5FB3C029" wp14:editId="35DB3DCE">
+          <wp:inline distT="0" distB="0" distL="0" distR="0" wp14:anchorId="5FB3C029" wp14:editId="58FAC1E5">
             <wp:extent cx="5727982" cy="3931920"/>
             <wp:effectExtent l="0" t="0" r="6350" b="0"/>
             <wp:docPr id="376644551" name="Picture 1"/>
@@ -3275,9 +3340,9 @@
           <w:bdr w:val="none" w:sz="0" w:space="0" w:color="auto" w:frame="1"/>
         </w:rPr>
         <w:drawing>
-          <wp:inline distT="0" distB="0" distL="0" distR="0" wp14:anchorId="0570409C" wp14:editId="336888CB">
-            <wp:extent cx="5731510" cy="5382260"/>
-            <wp:effectExtent l="0" t="0" r="2540" b="8890"/>
+          <wp:inline distT="0" distB="0" distL="0" distR="0" wp14:anchorId="0570409C" wp14:editId="78E85D63">
+            <wp:extent cx="5731508" cy="5382260"/>
+            <wp:effectExtent l="0" t="0" r="3175" b="8890"/>
             <wp:docPr id="158558200" name="Picture 1"/>
             <wp:cNvGraphicFramePr>
               <a:graphicFrameLocks xmlns:a="http://schemas.openxmlformats.org/drawingml/2006/main" noChangeAspect="1"/>
@@ -3286,11 +3351,17 @@
               <a:graphicData uri="http://schemas.openxmlformats.org/drawingml/2006/picture">
                 <pic:pic xmlns:pic="http://schemas.openxmlformats.org/drawingml/2006/picture">
                   <pic:nvPicPr>
-                    <pic:cNvPr id="158558200" name=""/>
+                    <pic:cNvPr id="158558200" name="Picture 1"/>
                     <pic:cNvPicPr/>
                   </pic:nvPicPr>
                   <pic:blipFill>
-                    <a:blip r:embed="rId10"/>
+                    <a:blip r:embed="rId10">
+                      <a:extLst>
+                        <a:ext uri="{28A0092B-C50C-407E-A947-70E740481C1C}">
+                          <a14:useLocalDpi xmlns:a14="http://schemas.microsoft.com/office/drawing/2010/main" val="0"/>
+                        </a:ext>
+                      </a:extLst>
+                    </a:blip>
                     <a:stretch>
                       <a:fillRect/>
                     </a:stretch>
@@ -3298,7 +3369,7 @@
                   <pic:spPr>
                     <a:xfrm>
                       <a:off x="0" y="0"/>
-                      <a:ext cx="5731510" cy="5382260"/>
+                      <a:ext cx="5731508" cy="5382260"/>
                     </a:xfrm>
                     <a:prstGeom prst="rect">
                       <a:avLst/>
@@ -3317,7 +3388,23 @@
         <w:jc w:val="both"/>
       </w:pPr>
       <w:r>
-        <w:t xml:space="preserve">The Board class manages the value of each cell by an array table[], indexed from the left Mandarin square and continuing in the clockwise direction around the board. One of the most important methods in the Board class is moveGem(), which implements the </w:t>
+        <w:t xml:space="preserve">The Board class manages the value of each cell by an array </w:t>
+      </w:r>
+      <w:proofErr w:type="gramStart"/>
+      <w:r>
+        <w:t>table[</w:t>
+      </w:r>
+      <w:proofErr w:type="gramEnd"/>
+      <w:r>
+        <w:t xml:space="preserve">], indexed from the left Mandarin square and continuing in the clockwise direction around the board. One of the most important methods in the Board class is </w:t>
+      </w:r>
+      <w:proofErr w:type="gramStart"/>
+      <w:r>
+        <w:t>moveGem(</w:t>
+      </w:r>
+      <w:proofErr w:type="gramEnd"/>
+      <w:r>
+        <w:t xml:space="preserve">), which implements the </w:t>
       </w:r>
       <w:r>
         <w:lastRenderedPageBreak/>
@@ -3330,7 +3417,47 @@
         <w:jc w:val="both"/>
       </w:pPr>
       <w:r>
-        <w:t>The most important methods are processingTurn() and postTurnProcessing() in the Game class, which together manage the majority of the game logic. processingTurn() handles the turn after receiving the input. It first calls the moveGem() method from the Board class to receive a move sequence. It then performs the capturing logic based on the final position of the move, before returning a full move sequence from the start until the end of a turn. This move sequence is later used by the Controller to update the GUI and animate the gameplay.</w:t>
+        <w:t xml:space="preserve">The most important methods are </w:t>
+      </w:r>
+      <w:proofErr w:type="gramStart"/>
+      <w:r>
+        <w:t>processingTurn(</w:t>
+      </w:r>
+      <w:proofErr w:type="gramEnd"/>
+      <w:r>
+        <w:t xml:space="preserve">) and </w:t>
+      </w:r>
+      <w:proofErr w:type="gramStart"/>
+      <w:r>
+        <w:t>postTurnProcessing(</w:t>
+      </w:r>
+      <w:proofErr w:type="gramEnd"/>
+      <w:r>
+        <w:t xml:space="preserve">) in the Game class, which together manage </w:t>
+      </w:r>
+      <w:proofErr w:type="gramStart"/>
+      <w:r>
+        <w:t>the majority of</w:t>
+      </w:r>
+      <w:proofErr w:type="gramEnd"/>
+      <w:r>
+        <w:t xml:space="preserve"> the game logic. </w:t>
+      </w:r>
+      <w:proofErr w:type="gramStart"/>
+      <w:r>
+        <w:t>processingTurn(</w:t>
+      </w:r>
+      <w:proofErr w:type="gramEnd"/>
+      <w:r>
+        <w:t xml:space="preserve">) handles the turn after receiving the input. It first calls the </w:t>
+      </w:r>
+      <w:proofErr w:type="gramStart"/>
+      <w:r>
+        <w:t>moveGem(</w:t>
+      </w:r>
+      <w:proofErr w:type="gramEnd"/>
+      <w:r>
+        <w:t>) method from the Board class to receive a move sequence. It then performs the capturing logic based on the final position of the move, before returning a full move sequence from the start until the end of a turn. This move sequence is later used by the Controller to update the GUI and animate the gameplay.</w:t>
       </w:r>
     </w:p>
     <w:p>
@@ -3338,8 +3465,21 @@
         <w:spacing w:after="120" w:line="312" w:lineRule="auto"/>
         <w:jc w:val="both"/>
       </w:pPr>
-      <w:r>
-        <w:t>postTurnProcessing() is responsible for handling the game state after a turn has been completed, including the ending check, the empty-squares check, and switching the player's turn. By separating turn execution and post-turn processing into two methods, the game logic remains modular and easier to maintain.</w:t>
+      <w:proofErr w:type="gramStart"/>
+      <w:r>
+        <w:t>postTurnProcessing(</w:t>
+      </w:r>
+      <w:proofErr w:type="gramEnd"/>
+      <w:r>
+        <w:t xml:space="preserve">) is responsible for handling the game state after a turn has been completed, including the ending check, the </w:t>
+      </w:r>
+      <w:proofErr w:type="gramStart"/>
+      <w:r>
+        <w:t>empty-squares</w:t>
+      </w:r>
+      <w:proofErr w:type="gramEnd"/>
+      <w:r>
+        <w:t xml:space="preserve"> check, and switching the player's turn. By separating turn execution and post-turn processing into two methods, the game logic remains modular and easier to maintain.</w:t>
       </w:r>
     </w:p>
     <w:p>
@@ -3388,10 +3528,10 @@
         </w:rPr>
         <w:lastRenderedPageBreak/>
         <w:drawing>
-          <wp:inline distT="0" distB="0" distL="0" distR="0" wp14:anchorId="7CE66F46" wp14:editId="57A8DFDA">
-            <wp:extent cx="5731510" cy="4351020"/>
-            <wp:effectExtent l="0" t="0" r="2540" b="0"/>
-            <wp:docPr id="1202433869" name="Picture 4" descr="A screenshot of a computer&#10;&#10;Description automatically generated"/>
+          <wp:inline distT="0" distB="0" distL="0" distR="0" wp14:anchorId="7CE66F46" wp14:editId="03AE8396">
+            <wp:extent cx="5725772" cy="4351020"/>
+            <wp:effectExtent l="0" t="0" r="8890" b="0"/>
+            <wp:docPr id="1202433869" name="Picture 4"/>
             <wp:cNvGraphicFramePr>
               <a:graphicFrameLocks xmlns:a="http://schemas.openxmlformats.org/drawingml/2006/main" noChangeAspect="1"/>
             </wp:cNvGraphicFramePr>
@@ -3399,20 +3539,19 @@
               <a:graphicData uri="http://schemas.openxmlformats.org/drawingml/2006/picture">
                 <pic:pic xmlns:pic="http://schemas.openxmlformats.org/drawingml/2006/picture">
                   <pic:nvPicPr>
-                    <pic:cNvPr id="1202433869" name="Picture 4" descr="A screenshot of a computer&#10;&#10;Description automatically generated"/>
+                    <pic:cNvPr id="1202433869" name="Picture 4"/>
                     <pic:cNvPicPr>
                       <a:picLocks noChangeAspect="1" noChangeArrowheads="1"/>
                     </pic:cNvPicPr>
                   </pic:nvPicPr>
                   <pic:blipFill>
-                    <a:blip r:embed="rId11">
+                    <a:blip r:embed="rId11" cstate="print">
                       <a:extLst>
                         <a:ext uri="{28A0092B-C50C-407E-A947-70E740481C1C}">
                           <a14:useLocalDpi xmlns:a14="http://schemas.microsoft.com/office/drawing/2010/main" val="0"/>
                         </a:ext>
                       </a:extLst>
                     </a:blip>
-                    <a:srcRect/>
                     <a:stretch>
                       <a:fillRect/>
                     </a:stretch>
@@ -3420,7 +3559,7 @@
                   <pic:spPr bwMode="auto">
                     <a:xfrm>
                       <a:off x="0" y="0"/>
-                      <a:ext cx="5731510" cy="4351020"/>
+                      <a:ext cx="5725772" cy="4351020"/>
                     </a:xfrm>
                     <a:prstGeom prst="rect">
                       <a:avLst/>
@@ -3452,7 +3591,39 @@
         <w:jc w:val="both"/>
       </w:pPr>
       <w:r>
-        <w:t>When the renderGemsInCell() method is invoked, GemRenderer selects the appropriate CellRenderer corresponding to the target cell and calls its render() method. Due to dynamic binding, the actual method executed depends on the runtime type of the object. For the two Mandarin cells (indices 0 and 6), the render() method of CastleCellRenderer is executed, which renders a BigGem and arranges any remaining SmallGem objects beneath it. For all other cells, the render() method of SmallCellRenderer is executed, which renders the SmallGem objects in a grid layout. This approach eliminates the need for conditional rendering logic inside GemRenderer and makes the rendering system easily extensible.</w:t>
+        <w:t xml:space="preserve">When the </w:t>
+      </w:r>
+      <w:proofErr w:type="gramStart"/>
+      <w:r>
+        <w:t>renderGemsInCell(</w:t>
+      </w:r>
+      <w:proofErr w:type="gramEnd"/>
+      <w:r>
+        <w:t xml:space="preserve">) method is invoked, GemRenderer selects the appropriate CellRenderer corresponding to the target cell and calls its </w:t>
+      </w:r>
+      <w:proofErr w:type="gramStart"/>
+      <w:r>
+        <w:t>render(</w:t>
+      </w:r>
+      <w:proofErr w:type="gramEnd"/>
+      <w:r>
+        <w:t xml:space="preserve">) method. Due to dynamic binding, the actual method executed depends on the runtime type of the object. For the two Mandarin cells (indices 0 and 6), the </w:t>
+      </w:r>
+      <w:proofErr w:type="gramStart"/>
+      <w:r>
+        <w:t>render(</w:t>
+      </w:r>
+      <w:proofErr w:type="gramEnd"/>
+      <w:r>
+        <w:t xml:space="preserve">) method of CastleCellRenderer is executed, which renders a BigGem and arranges any remaining SmallGem objects beneath it. For all other cells, the </w:t>
+      </w:r>
+      <w:proofErr w:type="gramStart"/>
+      <w:r>
+        <w:t>render(</w:t>
+      </w:r>
+      <w:proofErr w:type="gramEnd"/>
+      <w:r>
+        <w:t>) method of SmallCellRenderer is executed, which renders the SmallGem objects in a grid layout. This approach eliminates the need for conditional rendering logic inside GemRenderer and makes the rendering system easily extensible.</w:t>
       </w:r>
     </w:p>
     <w:p>
@@ -3555,7 +3726,23 @@
         <w:jc w:val="both"/>
       </w:pPr>
       <w:r>
-        <w:t>The main gameplay flow within the Controller package is managed by MainGameController. User input is handled through the getInput() method, which processes mouse-click events generated by the player. This method utilizes two important attributes: state and selectedSquare. The selectedSquare attribute stores the square currently chosen by the player, while state tracks the current stage of the input process.</w:t>
+        <w:t xml:space="preserve">The main gameplay flow within the Controller package is managed by MainGameController. User input is handled through the </w:t>
+      </w:r>
+      <w:proofErr w:type="gramStart"/>
+      <w:r>
+        <w:t>getInput(</w:t>
+      </w:r>
+      <w:proofErr w:type="gramEnd"/>
+      <w:r>
+        <w:t xml:space="preserve">) method, which processes mouse-click events generated by the player. This method utilizes two important attributes: state and </w:t>
+      </w:r>
+      <w:proofErr w:type="gramStart"/>
+      <w:r>
+        <w:t>selectedSquare</w:t>
+      </w:r>
+      <w:proofErr w:type="gramEnd"/>
+      <w:r>
+        <w:t>. The selectedSquare attribute stores the square currently chosen by the player, while state tracks the current stage of the input process.</w:t>
       </w:r>
     </w:p>
     <w:p>
@@ -3564,7 +3751,31 @@
         <w:jc w:val="both"/>
       </w:pPr>
       <w:r>
-        <w:t>Initially, state is set to 1, representing the square-selection phase. In this state, getInput() validates whether the clicked square is a valid choice by calling the corresponding validation methods in the Game class. If the selection is valid, the selected square is stored and state is updated to 2. In state 2, the controller waits for the player to choose a movement direction. If the player clicks the selected square again, the square is deselected and state returns to 1. Otherwise, if a valid adjacent square is chosen to indicate a direction, the onPlayerMove() method is invoked to execute the move. The instance of SquareHighlighter helps to show the available squares in every state to the players.</w:t>
+        <w:t xml:space="preserve">Initially, state is set to 1, representing the square-selection phase. In this state, </w:t>
+      </w:r>
+      <w:proofErr w:type="gramStart"/>
+      <w:r>
+        <w:t>getInput(</w:t>
+      </w:r>
+      <w:proofErr w:type="gramEnd"/>
+      <w:r>
+        <w:t xml:space="preserve">) validates whether the clicked square is a valid choice by calling the corresponding validation methods in the Game class. If the selection is valid, the selected square is </w:t>
+      </w:r>
+      <w:proofErr w:type="gramStart"/>
+      <w:r>
+        <w:t>stored</w:t>
+      </w:r>
+      <w:proofErr w:type="gramEnd"/>
+      <w:r>
+        <w:t xml:space="preserve"> and state is updated to 2. In state 2, the controller waits for the player to choose a movement direction. If the player clicks the selected square again, the square is deselected and state returns to 1. Otherwise, if a valid adjacent square is chosen to indicate a direction, the </w:t>
+      </w:r>
+      <w:proofErr w:type="gramStart"/>
+      <w:r>
+        <w:t>onPlayerMove(</w:t>
+      </w:r>
+      <w:proofErr w:type="gramEnd"/>
+      <w:r>
+        <w:t>) method is invoked to execute the move. The instance of SquareHighlighter helps to show the available squares in every state to the players.</w:t>
       </w:r>
     </w:p>
     <w:p>
@@ -3573,7 +3784,31 @@
         <w:jc w:val="both"/>
       </w:pPr>
       <w:r>
-        <w:t>At the beginning of onPlayerMove(), state is set to -1 to temporarily disable further user interaction while the move is being processed and animated. The method first calls processingTurn() in the Game class to obtain the complete sequence of board changes resulting from the player's move, including any captures. This sequence is then passed to animateMoves(), which uses a JavaFX Timeline to display the movement step by step. This approach prevents the board from immediately updating to its final state and allows players to observe the progression of the move.</w:t>
+        <w:t xml:space="preserve">At the beginning of </w:t>
+      </w:r>
+      <w:proofErr w:type="gramStart"/>
+      <w:r>
+        <w:t>onPlayerMove(</w:t>
+      </w:r>
+      <w:proofErr w:type="gramEnd"/>
+      <w:r>
+        <w:t xml:space="preserve">), state is set to -1 to temporarily disable further user interaction while the move is being processed and animated. The method first calls </w:t>
+      </w:r>
+      <w:proofErr w:type="gramStart"/>
+      <w:r>
+        <w:t>processingTurn(</w:t>
+      </w:r>
+      <w:proofErr w:type="gramEnd"/>
+      <w:r>
+        <w:t xml:space="preserve">) in the Game class to obtain the complete sequence of board changes resulting from the player's move, including any captures. This sequence is then passed to </w:t>
+      </w:r>
+      <w:proofErr w:type="gramStart"/>
+      <w:r>
+        <w:t>animateMoves(</w:t>
+      </w:r>
+      <w:proofErr w:type="gramEnd"/>
+      <w:r>
+        <w:t>), which uses a JavaFX Timeline to display the movement step by step. This approach prevents the board from immediately updating to its final state and allows players to observe the progression of the move.</w:t>
       </w:r>
     </w:p>
     <w:p>
@@ -3582,23 +3817,55 @@
         <w:jc w:val="both"/>
       </w:pPr>
       <w:r>
-        <w:t>After the animation finishes, the controller updates the score display and calls postTurnProcessing() in the Game class.</w:t>
+        <w:t xml:space="preserve">After the animation finishes, the controller updates the score display and calls </w:t>
+      </w:r>
+      <w:proofErr w:type="gramStart"/>
+      <w:r>
+        <w:t>postTurnProcessing(</w:t>
+      </w:r>
+      <w:proofErr w:type="gramEnd"/>
+      <w:r>
+        <w:t>) in the Game class.</w:t>
       </w:r>
       <w:r>
         <w:t xml:space="preserve"> </w:t>
       </w:r>
       <w:r>
-        <w:t xml:space="preserve">If the game has ended, postGameVisualEffect() is executed to clear the board visually and highlight the winner by making the winning score flicker. Finally, the ending scene is loaded to display the </w:t>
+        <w:t xml:space="preserve">If the game has ended, </w:t>
+      </w:r>
+      <w:proofErr w:type="gramStart"/>
+      <w:r>
+        <w:t>postGameVisualEffect(</w:t>
+      </w:r>
+      <w:proofErr w:type="gramEnd"/>
+      <w:r>
+        <w:t xml:space="preserve">) is executed to clear the board visually and highlight the winner by making the winning score flicker. Finally, the ending scene is loaded to display the </w:t>
       </w:r>
       <w:r>
         <w:lastRenderedPageBreak/>
         <w:t>game result.</w:t>
       </w:r>
       <w:r>
-        <w:t xml:space="preserve"> p</w:t>
-      </w:r>
-      <w:r>
-        <w:t>rocessingTurn() and postTurnProcessing() are intentionally implemented in the Game class rather than in MainGameController. This separation ensures that the controller manages user interaction and presentation, while the Game class remains responsible for the game rules and logic, following the MVC architecture.</w:t>
+        <w:t xml:space="preserve"> </w:t>
+      </w:r>
+      <w:proofErr w:type="gramStart"/>
+      <w:r>
+        <w:t>p</w:t>
+      </w:r>
+      <w:r>
+        <w:t>rocessingTurn(</w:t>
+      </w:r>
+      <w:proofErr w:type="gramEnd"/>
+      <w:r>
+        <w:t xml:space="preserve">) and </w:t>
+      </w:r>
+      <w:proofErr w:type="gramStart"/>
+      <w:r>
+        <w:t>postTurnProcessing(</w:t>
+      </w:r>
+      <w:proofErr w:type="gramEnd"/>
+      <w:r>
+        <w:t>) are intentionally implemented in the Game class rather than in MainGameController. This separation ensures that the controller manages user interaction and presentation, while the Game class remains responsible for the game rules and logic, following the MVC architecture.</w:t>
       </w:r>
     </w:p>
     <w:sectPr>

</xml_diff>